<commit_message>
Manag ass for WI
Assistant in Westerdijk institute
</commit_message>
<xml_diff>
--- a/Motivation_letter_management assistant.docx
+++ b/Motivation_letter_management assistant.docx
@@ -12,14 +12,13 @@
       <w:r>
         <w:t xml:space="preserve"> </w:t>
       </w:r>
-      <w:r>
-        <w:t xml:space="preserve">Soil physics </w:t>
-      </w:r>
-      <w:r>
-        <w:t>and Land Management group</w:t>
-      </w:r>
-      <w:r>
-        <w:t xml:space="preserve"> (SLM)</w:t>
+      <w:proofErr w:type="spellStart"/>
+      <w:r>
+        <w:t>Westerdijk</w:t>
+      </w:r>
+      <w:proofErr w:type="spellEnd"/>
+      <w:r>
+        <w:t xml:space="preserve"> Fungal Biodiversity Institute</w:t>
       </w:r>
       <w:r>
         <w:t>,</w:t>
@@ -59,7 +58,7 @@
         <w:t xml:space="preserve">of </w:t>
       </w:r>
       <w:r>
-        <w:t xml:space="preserve">Management/Office </w:t>
+        <w:t xml:space="preserve">Management </w:t>
       </w:r>
       <w:r>
         <w:t>Assistant</w:t>
@@ -144,7 +143,7 @@
         <w:t xml:space="preserve"> about this opportunity to </w:t>
       </w:r>
       <w:r>
-        <w:t xml:space="preserve">assist the SLM management team </w:t>
+        <w:t xml:space="preserve">assist the management team </w:t>
       </w:r>
       <w:r>
         <w:t>with administrative tasks and create a nice positive vibe within the team</w:t>
@@ -226,7 +225,13 @@
         <w:t>about</w:t>
       </w:r>
       <w:r>
-        <w:t xml:space="preserve"> university environment.</w:t>
+        <w:t xml:space="preserve"> university </w:t>
+      </w:r>
+      <w:r>
+        <w:t xml:space="preserve">and research </w:t>
+      </w:r>
+      <w:r>
+        <w:t>environment.</w:t>
       </w:r>
       <w:r>
         <w:t xml:space="preserve"> </w:t>
@@ -405,10 +410,7 @@
         <w:t xml:space="preserve">professional experiences, position me as a strong candidate for the </w:t>
       </w:r>
       <w:r>
-        <w:t>Management/Office Assistant</w:t>
-      </w:r>
-      <w:r>
-        <w:t xml:space="preserve"> </w:t>
+        <w:t xml:space="preserve">Management Assistant </w:t>
       </w:r>
       <w:r>
         <w:t>role.</w:t>

</xml_diff>